<commit_message>
Deliver updated Drawn by Grace linked manuscript
</commit_message>
<xml_diff>
--- a/Project Rooms/Jennys Drawings/outputs/Drawn by Grace - Linked Review Manuscript.docx
+++ b/Project Rooms/Jennys Drawings/outputs/Drawn by Grace - Linked Review Manuscript.docx
@@ -4,118 +4,42 @@
   <w:body>
     <w:p>
       <w:pPr>
-        <w:spacing w:after="160"/>
-      </w:pPr>
-    </w:p>
-    <w:p>
-      <w:pPr>
-        <w:spacing w:after="160"/>
-      </w:pPr>
-    </w:p>
-    <w:p>
-      <w:pPr>
-        <w:spacing w:after="160"/>
-      </w:pPr>
-    </w:p>
-    <w:p>
-      <w:pPr>
-        <w:spacing w:after="160"/>
-      </w:pPr>
-    </w:p>
-    <w:p>
-      <w:pPr>
-        <w:spacing w:after="160"/>
-      </w:pPr>
-    </w:p>
-    <w:p>
-      <w:pPr>
-        <w:spacing w:after="320"/>
+        <w:spacing w:before="0" w:after="0" w:line="240" w:lineRule="auto"/>
         <w:jc w:val="center"/>
       </w:pPr>
       <w:r>
-        <w:rPr>
-          <w:rFonts w:ascii="Calibri" w:hAnsi="Calibri"/>
-          <w:b/>
-          <w:color w:val="B08D3B"/>
-          <w:sz w:val="21"/>
-        </w:rPr>
-        <w:t>A LIGHTWEIGHT VISUAL COMPANION</w:t>
-      </w:r>
-    </w:p>
-    <w:p>
-      <w:pPr>
-        <w:spacing w:after="180"/>
-        <w:jc w:val="center"/>
-      </w:pPr>
-      <w:r>
-        <w:rPr>
-          <w:rFonts w:ascii="Calibri" w:hAnsi="Calibri"/>
-          <w:b/>
-          <w:color w:val="203748"/>
-          <w:sz w:val="60"/>
-        </w:rPr>
-        <w:t>Drawn by Grace</w:t>
-      </w:r>
-    </w:p>
-    <w:p>
-      <w:pPr>
-        <w:spacing w:after="600"/>
-        <w:jc w:val="center"/>
-      </w:pPr>
-      <w:r>
-        <w:rPr>
-          <w:rFonts w:ascii="Calibri" w:hAnsi="Calibri"/>
-          <w:i/>
-          <w:color w:val="1F4D78"/>
-          <w:sz w:val="30"/>
-        </w:rPr>
-        <w:t>A Visual Companion to The Gracious Millionaire</w:t>
-      </w:r>
-    </w:p>
-    <w:p>
-      <w:pPr>
-        <w:jc w:val="center"/>
-      </w:pPr>
-      <w:r>
-        <w:rPr>
-          <w:rFonts w:ascii="Calibri" w:hAnsi="Calibri"/>
-          <w:b/>
-          <w:color w:val="203748"/>
-          <w:sz w:val="23"/>
-        </w:rPr>
-        <w:t>Featuring drawings by Jenny Browning</w:t>
-      </w:r>
-    </w:p>
-    <w:p>
-      <w:pPr>
-        <w:spacing w:before="320"/>
-        <w:jc w:val="center"/>
-      </w:pPr>
-      <w:hyperlink r:id="rId11">
-        <w:r>
-          <w:rPr>
-            <w:rFonts w:ascii="Calibri" w:hAnsi="Calibri"/>
-            <w:color w:val="2E74B5"/>
-            <w:u w:val="single"/>
-            <w:sz w:val="22"/>
-            <w:b/>
-          </w:rPr>
-          <w:t>Open the complete drawing folder in Teams</w:t>
-        </w:r>
-      </w:hyperlink>
-    </w:p>
-    <w:p>
-      <w:pPr>
-        <w:spacing w:before="360"/>
-        <w:jc w:val="center"/>
-      </w:pPr>
-      <w:r>
-        <w:rPr>
-          <w:rFonts w:ascii="Calibri" w:hAnsi="Calibri"/>
-          <w:color w:val="666666"/>
-          <w:sz w:val="19"/>
-        </w:rPr>
-        <w:t>LINKED REVIEW MANUSCRIPT  |  JULY 2026</w:t>
+        <w:drawing>
+          <wp:inline xmlns:a="http://schemas.openxmlformats.org/drawingml/2006/main" xmlns:pic="http://schemas.openxmlformats.org/drawingml/2006/picture">
+            <wp:extent cx="5212080" cy="7818120"/>
+            <wp:docPr id="1" name="Picture 1"/>
+            <wp:cNvGraphicFramePr>
+              <a:graphicFrameLocks noChangeAspect="1"/>
+            </wp:cNvGraphicFramePr>
+            <a:graphic>
+              <a:graphicData uri="http://schemas.openxmlformats.org/drawingml/2006/picture">
+                <pic:pic>
+                  <pic:nvPicPr>
+                    <pic:cNvPr id="0" name="drawn-by-grace-cover-jenny-style-v2.png"/>
+                    <pic:cNvPicPr/>
+                  </pic:nvPicPr>
+                  <pic:blipFill>
+                    <a:blip r:embed="rId11"/>
+                    <a:stretch>
+                      <a:fillRect/>
+                    </a:stretch>
+                  </pic:blipFill>
+                  <pic:spPr>
+                    <a:xfrm>
+                      <a:off x="0" y="0"/>
+                      <a:ext cx="5212080" cy="7818120"/>
+                    </a:xfrm>
+                    <a:prstGeom prst="rect"/>
+                  </pic:spPr>
+                </pic:pic>
+              </a:graphicData>
+            </a:graphic>
+          </wp:inline>
+        </w:drawing>
       </w:r>
     </w:p>
     <w:p>

</xml_diff>

<commit_message>
Send latest Drawn by Grace manuscript attachment
</commit_message>
<xml_diff>
--- a/Project Rooms/Jennys Drawings/outputs/Drawn by Grace - Linked Review Manuscript.docx
+++ b/Project Rooms/Jennys Drawings/outputs/Drawn by Grace - Linked Review Manuscript.docx
@@ -19,7 +19,7 @@
               <a:graphicData uri="http://schemas.openxmlformats.org/drawingml/2006/picture">
                 <pic:pic>
                   <pic:nvPicPr>
-                    <pic:cNvPr id="0" name="drawn-by-grace-cover-jenny-style-v2.png"/>
+                    <pic:cNvPr id="0" name="drawn-by-grace-cover-jenny-style-v2-email.jpg"/>
                     <pic:cNvPicPr/>
                   </pic:nvPicPr>
                   <pic:blipFill>
@@ -2757,23 +2757,7 @@
   <w:p>
     <w:pPr>
       <w:pStyle w:val="Footer"/>
-      <w:jc w:val="right"/>
     </w:pPr>
-    <w:r>
-      <w:rPr>
-        <w:rFonts w:ascii="Calibri" w:hAnsi="Calibri"/>
-        <w:color w:val="666666"/>
-        <w:sz w:val="17"/>
-      </w:rPr>
-      <w:t xml:space="preserve">DRAWN BY GRACE  |  </w:t>
-    </w:r>
-    <w:r>
-      <w:fldChar w:fldCharType="begin"/>
-      <w:instrText xml:space="preserve"> PAGE </w:instrText>
-      <w:fldChar w:fldCharType="separate"/>
-      <w:t>1</w:t>
-      <w:fldChar w:fldCharType="end"/>
-    </w:r>
   </w:p>
 </w:ftr>
 </file>
@@ -2783,17 +2767,7 @@
   <w:p>
     <w:pPr>
       <w:pStyle w:val="Header"/>
-      <w:jc w:val="center"/>
     </w:pPr>
-    <w:r>
-      <w:rPr>
-        <w:rFonts w:ascii="Calibri" w:hAnsi="Calibri"/>
-        <w:b/>
-        <w:color w:val="666666"/>
-        <w:sz w:val="17"/>
-      </w:rPr>
-      <w:t>DRAWN BY GRACE  |  LINKED REVIEW MANUSCRIPT</w:t>
-    </w:r>
   </w:p>
 </w:hdr>
 </file>

</xml_diff>